<commit_message>
md2docx: heading 스타일 복원 후처리 3종 + userlist cascade 추출 + 인자 규약 정리
- postprocess_style_numbering.py: pandoc 이 덮어쓴 numbering.xml 에 style-참조 numId 정의 복원
- postprocess_inline_basedon.py: customStyle basedOn 체인 pPr/rPr 을 leaf 에 인라인 베이킹
- postprocess_remap_pstyle.py: case_mismatch alias pStyle 을 회사 원본 styleId 로 정규화 (갤러리 하이라이트)
- userlist_extract.py: styles.xml docDefaults/기본 단락 스타일 cascade 해소해 effective pPr/rPr 추출
- userlist_scan_lists.py + postprocess_userlist.py: pandoc 출력 list_kind→cluster 매핑 후처리
- md2docx.py: template/renew 서브커맨드 + cached/fresh 자동 분기
</commit_message>
<xml_diff>
--- a/.claude/skills/md2docx/references/reference_reg.docx
+++ b/.claude/skills/md2docx/references/reference_reg.docx
@@ -413,326 +413,261 @@
       </w:tr>
     </w:tbl>
     <w:p/>
-    <w:tbl>
-      <w:tblPr>
-        <w:tblStyle w:val="10"/>
-        <w:tblW w:w="0" w:type="auto"/>
-        <w:tblLook w:val="04A0" w:firstRow="1" w:lastRow="0" w:firstColumn="1" w:lastColumn="0" w:noHBand="0" w:noVBand="1"/>
-      </w:tblPr>
-      <w:tblGrid>
-        <w:gridCol w:w="1496"/>
-        <w:gridCol w:w="1496"/>
-        <w:gridCol w:w="1497"/>
-        <w:gridCol w:w="1497"/>
-        <w:gridCol w:w="1497"/>
-        <w:gridCol w:w="1497"/>
-      </w:tblGrid>
-      <w:tr>
-        <w:trPr>
-          <w:cnfStyle w:val="100000000000" w:firstRow="1" w:lastRow="0" w:firstColumn="0" w:lastColumn="0" w:oddVBand="0" w:evenVBand="0" w:oddHBand="0" w:evenHBand="0" w:firstRowFirstColumn="0" w:firstRowLastColumn="0" w:lastRowFirstColumn="0" w:lastRowLastColumn="0"/>
-        </w:trPr>
-        <w:tc>
-          <w:tcPr>
-            <w:cnfStyle w:val="001000000000" w:firstRow="0" w:lastRow="0" w:firstColumn="1" w:lastColumn="0" w:oddVBand="0" w:evenVBand="0" w:oddHBand="0" w:evenHBand="0" w:firstRowFirstColumn="0" w:firstRowLastColumn="0" w:lastRowFirstColumn="0" w:lastRowLastColumn="0"/>
-            <w:tcW w:w="1496" w:type="dxa"/>
-          </w:tcPr>
-          <w:p/>
-        </w:tc>
-        <w:tc>
-          <w:tcPr>
-            <w:tcW w:w="1496" w:type="dxa"/>
-          </w:tcPr>
-          <w:p>
-            <w:pPr>
-              <w:cnfStyle w:val="100000000000" w:firstRow="1" w:lastRow="0" w:firstColumn="0" w:lastColumn="0" w:oddVBand="0" w:evenVBand="0" w:oddHBand="0" w:evenHBand="0" w:firstRowFirstColumn="0" w:firstRowLastColumn="0" w:lastRowFirstColumn="0" w:lastRowLastColumn="0"/>
-            </w:pPr>
-          </w:p>
-        </w:tc>
-        <w:tc>
-          <w:tcPr>
-            <w:tcW w:w="1497" w:type="dxa"/>
-          </w:tcPr>
-          <w:p>
-            <w:pPr>
-              <w:cnfStyle w:val="100000000000" w:firstRow="1" w:lastRow="0" w:firstColumn="0" w:lastColumn="0" w:oddVBand="0" w:evenVBand="0" w:oddHBand="0" w:evenHBand="0" w:firstRowFirstColumn="0" w:firstRowLastColumn="0" w:lastRowFirstColumn="0" w:lastRowLastColumn="0"/>
-            </w:pPr>
-          </w:p>
-        </w:tc>
-        <w:tc>
-          <w:tcPr>
-            <w:tcW w:w="1497" w:type="dxa"/>
-          </w:tcPr>
-          <w:p>
-            <w:pPr>
-              <w:cnfStyle w:val="100000000000" w:firstRow="1" w:lastRow="0" w:firstColumn="0" w:lastColumn="0" w:oddVBand="0" w:evenVBand="0" w:oddHBand="0" w:evenHBand="0" w:firstRowFirstColumn="0" w:firstRowLastColumn="0" w:lastRowFirstColumn="0" w:lastRowLastColumn="0"/>
-            </w:pPr>
-          </w:p>
-        </w:tc>
-        <w:tc>
-          <w:tcPr>
-            <w:tcW w:w="1497" w:type="dxa"/>
-          </w:tcPr>
-          <w:p>
-            <w:pPr>
-              <w:cnfStyle w:val="100000000000" w:firstRow="1" w:lastRow="0" w:firstColumn="0" w:lastColumn="0" w:oddVBand="0" w:evenVBand="0" w:oddHBand="0" w:evenHBand="0" w:firstRowFirstColumn="0" w:firstRowLastColumn="0" w:lastRowFirstColumn="0" w:lastRowLastColumn="0"/>
-            </w:pPr>
-          </w:p>
-        </w:tc>
-        <w:tc>
-          <w:tcPr>
-            <w:tcW w:w="1497" w:type="dxa"/>
-          </w:tcPr>
-          <w:p>
-            <w:pPr>
-              <w:cnfStyle w:val="100000000000" w:firstRow="1" w:lastRow="0" w:firstColumn="0" w:lastColumn="0" w:oddVBand="0" w:evenVBand="0" w:oddHBand="0" w:evenHBand="0" w:firstRowFirstColumn="0" w:firstRowLastColumn="0" w:lastRowFirstColumn="0" w:lastRowLastColumn="0"/>
-            </w:pPr>
-          </w:p>
-        </w:tc>
-      </w:tr>
-      <w:tr>
-        <w:trPr>
-          <w:cnfStyle w:val="000000100000" w:firstRow="0" w:lastRow="0" w:firstColumn="0" w:lastColumn="0" w:oddVBand="0" w:evenVBand="0" w:oddHBand="1" w:evenHBand="0" w:firstRowFirstColumn="0" w:firstRowLastColumn="0" w:lastRowFirstColumn="0" w:lastRowLastColumn="0"/>
-        </w:trPr>
-        <w:tc>
-          <w:tcPr>
-            <w:cnfStyle w:val="001000000000" w:firstRow="0" w:lastRow="0" w:firstColumn="1" w:lastColumn="0" w:oddVBand="0" w:evenVBand="0" w:oddHBand="0" w:evenHBand="0" w:firstRowFirstColumn="0" w:firstRowLastColumn="0" w:lastRowFirstColumn="0" w:lastRowLastColumn="0"/>
-            <w:tcW w:w="1496" w:type="dxa"/>
-          </w:tcPr>
-          <w:p/>
-        </w:tc>
-        <w:tc>
-          <w:tcPr>
-            <w:tcW w:w="1496" w:type="dxa"/>
-          </w:tcPr>
-          <w:p>
-            <w:pPr>
-              <w:cnfStyle w:val="000000100000" w:firstRow="0" w:lastRow="0" w:firstColumn="0" w:lastColumn="0" w:oddVBand="0" w:evenVBand="0" w:oddHBand="1" w:evenHBand="0" w:firstRowFirstColumn="0" w:firstRowLastColumn="0" w:lastRowFirstColumn="0" w:lastRowLastColumn="0"/>
-            </w:pPr>
-          </w:p>
-        </w:tc>
-        <w:tc>
-          <w:tcPr>
-            <w:tcW w:w="1497" w:type="dxa"/>
-          </w:tcPr>
-          <w:p>
-            <w:pPr>
-              <w:cnfStyle w:val="000000100000" w:firstRow="0" w:lastRow="0" w:firstColumn="0" w:lastColumn="0" w:oddVBand="0" w:evenVBand="0" w:oddHBand="1" w:evenHBand="0" w:firstRowFirstColumn="0" w:firstRowLastColumn="0" w:lastRowFirstColumn="0" w:lastRowLastColumn="0"/>
-            </w:pPr>
-          </w:p>
-        </w:tc>
-        <w:tc>
-          <w:tcPr>
-            <w:tcW w:w="1497" w:type="dxa"/>
-          </w:tcPr>
-          <w:p>
-            <w:pPr>
-              <w:cnfStyle w:val="000000100000" w:firstRow="0" w:lastRow="0" w:firstColumn="0" w:lastColumn="0" w:oddVBand="0" w:evenVBand="0" w:oddHBand="1" w:evenHBand="0" w:firstRowFirstColumn="0" w:firstRowLastColumn="0" w:lastRowFirstColumn="0" w:lastRowLastColumn="0"/>
-            </w:pPr>
-          </w:p>
-        </w:tc>
-        <w:tc>
-          <w:tcPr>
-            <w:tcW w:w="1497" w:type="dxa"/>
-          </w:tcPr>
-          <w:p>
-            <w:pPr>
-              <w:cnfStyle w:val="000000100000" w:firstRow="0" w:lastRow="0" w:firstColumn="0" w:lastColumn="0" w:oddVBand="0" w:evenVBand="0" w:oddHBand="1" w:evenHBand="0" w:firstRowFirstColumn="0" w:firstRowLastColumn="0" w:lastRowFirstColumn="0" w:lastRowLastColumn="0"/>
-            </w:pPr>
-          </w:p>
-        </w:tc>
-        <w:tc>
-          <w:tcPr>
-            <w:tcW w:w="1497" w:type="dxa"/>
-          </w:tcPr>
-          <w:p>
-            <w:pPr>
-              <w:cnfStyle w:val="000000100000" w:firstRow="0" w:lastRow="0" w:firstColumn="0" w:lastColumn="0" w:oddVBand="0" w:evenVBand="0" w:oddHBand="1" w:evenHBand="0" w:firstRowFirstColumn="0" w:firstRowLastColumn="0" w:lastRowFirstColumn="0" w:lastRowLastColumn="0"/>
-            </w:pPr>
-          </w:p>
-        </w:tc>
-      </w:tr>
-      <w:tr>
-        <w:tc>
-          <w:tcPr>
-            <w:cnfStyle w:val="001000000000" w:firstRow="0" w:lastRow="0" w:firstColumn="1" w:lastColumn="0" w:oddVBand="0" w:evenVBand="0" w:oddHBand="0" w:evenHBand="0" w:firstRowFirstColumn="0" w:firstRowLastColumn="0" w:lastRowFirstColumn="0" w:lastRowLastColumn="0"/>
-            <w:tcW w:w="1496" w:type="dxa"/>
-          </w:tcPr>
-          <w:p/>
-        </w:tc>
-        <w:tc>
-          <w:tcPr>
-            <w:tcW w:w="1496" w:type="dxa"/>
-          </w:tcPr>
-          <w:p>
-            <w:pPr>
-              <w:cnfStyle w:val="000000000000" w:firstRow="0" w:lastRow="0" w:firstColumn="0" w:lastColumn="0" w:oddVBand="0" w:evenVBand="0" w:oddHBand="0" w:evenHBand="0" w:firstRowFirstColumn="0" w:firstRowLastColumn="0" w:lastRowFirstColumn="0" w:lastRowLastColumn="0"/>
-            </w:pPr>
-          </w:p>
-        </w:tc>
-        <w:tc>
-          <w:tcPr>
-            <w:tcW w:w="1497" w:type="dxa"/>
-          </w:tcPr>
-          <w:p>
-            <w:pPr>
-              <w:cnfStyle w:val="000000000000" w:firstRow="0" w:lastRow="0" w:firstColumn="0" w:lastColumn="0" w:oddVBand="0" w:evenVBand="0" w:oddHBand="0" w:evenHBand="0" w:firstRowFirstColumn="0" w:firstRowLastColumn="0" w:lastRowFirstColumn="0" w:lastRowLastColumn="0"/>
-            </w:pPr>
-          </w:p>
-        </w:tc>
-        <w:tc>
-          <w:tcPr>
-            <w:tcW w:w="1497" w:type="dxa"/>
-          </w:tcPr>
-          <w:p>
-            <w:pPr>
-              <w:cnfStyle w:val="000000000000" w:firstRow="0" w:lastRow="0" w:firstColumn="0" w:lastColumn="0" w:oddVBand="0" w:evenVBand="0" w:oddHBand="0" w:evenHBand="0" w:firstRowFirstColumn="0" w:firstRowLastColumn="0" w:lastRowFirstColumn="0" w:lastRowLastColumn="0"/>
-            </w:pPr>
-          </w:p>
-        </w:tc>
-        <w:tc>
-          <w:tcPr>
-            <w:tcW w:w="1497" w:type="dxa"/>
-          </w:tcPr>
-          <w:p>
-            <w:pPr>
-              <w:cnfStyle w:val="000000000000" w:firstRow="0" w:lastRow="0" w:firstColumn="0" w:lastColumn="0" w:oddVBand="0" w:evenVBand="0" w:oddHBand="0" w:evenHBand="0" w:firstRowFirstColumn="0" w:firstRowLastColumn="0" w:lastRowFirstColumn="0" w:lastRowLastColumn="0"/>
-            </w:pPr>
-          </w:p>
-        </w:tc>
-        <w:tc>
-          <w:tcPr>
-            <w:tcW w:w="1497" w:type="dxa"/>
-          </w:tcPr>
-          <w:p>
-            <w:pPr>
-              <w:cnfStyle w:val="000000000000" w:firstRow="0" w:lastRow="0" w:firstColumn="0" w:lastColumn="0" w:oddVBand="0" w:evenVBand="0" w:oddHBand="0" w:evenHBand="0" w:firstRowFirstColumn="0" w:firstRowLastColumn="0" w:lastRowFirstColumn="0" w:lastRowLastColumn="0"/>
-            </w:pPr>
-          </w:p>
-        </w:tc>
-      </w:tr>
-      <w:tr>
-        <w:trPr>
-          <w:cnfStyle w:val="000000100000" w:firstRow="0" w:lastRow="0" w:firstColumn="0" w:lastColumn="0" w:oddVBand="0" w:evenVBand="0" w:oddHBand="1" w:evenHBand="0" w:firstRowFirstColumn="0" w:firstRowLastColumn="0" w:lastRowFirstColumn="0" w:lastRowLastColumn="0"/>
-        </w:trPr>
-        <w:tc>
-          <w:tcPr>
-            <w:cnfStyle w:val="001000000000" w:firstRow="0" w:lastRow="0" w:firstColumn="1" w:lastColumn="0" w:oddVBand="0" w:evenVBand="0" w:oddHBand="0" w:evenHBand="0" w:firstRowFirstColumn="0" w:firstRowLastColumn="0" w:lastRowFirstColumn="0" w:lastRowLastColumn="0"/>
-            <w:tcW w:w="1496" w:type="dxa"/>
-          </w:tcPr>
-          <w:p/>
-        </w:tc>
-        <w:tc>
-          <w:tcPr>
-            <w:tcW w:w="1496" w:type="dxa"/>
-          </w:tcPr>
-          <w:p>
-            <w:pPr>
-              <w:cnfStyle w:val="000000100000" w:firstRow="0" w:lastRow="0" w:firstColumn="0" w:lastColumn="0" w:oddVBand="0" w:evenVBand="0" w:oddHBand="1" w:evenHBand="0" w:firstRowFirstColumn="0" w:firstRowLastColumn="0" w:lastRowFirstColumn="0" w:lastRowLastColumn="0"/>
-            </w:pPr>
-          </w:p>
-        </w:tc>
-        <w:tc>
-          <w:tcPr>
-            <w:tcW w:w="1497" w:type="dxa"/>
-          </w:tcPr>
-          <w:p>
-            <w:pPr>
-              <w:cnfStyle w:val="000000100000" w:firstRow="0" w:lastRow="0" w:firstColumn="0" w:lastColumn="0" w:oddVBand="0" w:evenVBand="0" w:oddHBand="1" w:evenHBand="0" w:firstRowFirstColumn="0" w:firstRowLastColumn="0" w:lastRowFirstColumn="0" w:lastRowLastColumn="0"/>
-            </w:pPr>
-          </w:p>
-        </w:tc>
-        <w:tc>
-          <w:tcPr>
-            <w:tcW w:w="1497" w:type="dxa"/>
-          </w:tcPr>
-          <w:p>
-            <w:pPr>
-              <w:cnfStyle w:val="000000100000" w:firstRow="0" w:lastRow="0" w:firstColumn="0" w:lastColumn="0" w:oddVBand="0" w:evenVBand="0" w:oddHBand="1" w:evenHBand="0" w:firstRowFirstColumn="0" w:firstRowLastColumn="0" w:lastRowFirstColumn="0" w:lastRowLastColumn="0"/>
-            </w:pPr>
-          </w:p>
-        </w:tc>
-        <w:tc>
-          <w:tcPr>
-            <w:tcW w:w="1497" w:type="dxa"/>
-          </w:tcPr>
-          <w:p>
-            <w:pPr>
-              <w:cnfStyle w:val="000000100000" w:firstRow="0" w:lastRow="0" w:firstColumn="0" w:lastColumn="0" w:oddVBand="0" w:evenVBand="0" w:oddHBand="1" w:evenHBand="0" w:firstRowFirstColumn="0" w:firstRowLastColumn="0" w:lastRowFirstColumn="0" w:lastRowLastColumn="0"/>
-            </w:pPr>
-          </w:p>
-        </w:tc>
-        <w:tc>
-          <w:tcPr>
-            <w:tcW w:w="1497" w:type="dxa"/>
-          </w:tcPr>
-          <w:p>
-            <w:pPr>
-              <w:cnfStyle w:val="000000100000" w:firstRow="0" w:lastRow="0" w:firstColumn="0" w:lastColumn="0" w:oddVBand="0" w:evenVBand="0" w:oddHBand="1" w:evenHBand="0" w:firstRowFirstColumn="0" w:firstRowLastColumn="0" w:lastRowFirstColumn="0" w:lastRowLastColumn="0"/>
-            </w:pPr>
-          </w:p>
-        </w:tc>
-      </w:tr>
-      <w:tr>
-        <w:tc>
-          <w:tcPr>
-            <w:cnfStyle w:val="001000000000" w:firstRow="0" w:lastRow="0" w:firstColumn="1" w:lastColumn="0" w:oddVBand="0" w:evenVBand="0" w:oddHBand="0" w:evenHBand="0" w:firstRowFirstColumn="0" w:firstRowLastColumn="0" w:lastRowFirstColumn="0" w:lastRowLastColumn="0"/>
-            <w:tcW w:w="1496" w:type="dxa"/>
-          </w:tcPr>
-          <w:p/>
-        </w:tc>
-        <w:tc>
-          <w:tcPr>
-            <w:tcW w:w="1496" w:type="dxa"/>
-          </w:tcPr>
-          <w:p>
-            <w:pPr>
-              <w:cnfStyle w:val="000000000000" w:firstRow="0" w:lastRow="0" w:firstColumn="0" w:lastColumn="0" w:oddVBand="0" w:evenVBand="0" w:oddHBand="0" w:evenHBand="0" w:firstRowFirstColumn="0" w:firstRowLastColumn="0" w:lastRowFirstColumn="0" w:lastRowLastColumn="0"/>
-            </w:pPr>
-          </w:p>
-        </w:tc>
-        <w:tc>
-          <w:tcPr>
-            <w:tcW w:w="1497" w:type="dxa"/>
-          </w:tcPr>
-          <w:p>
-            <w:pPr>
-              <w:cnfStyle w:val="000000000000" w:firstRow="0" w:lastRow="0" w:firstColumn="0" w:lastColumn="0" w:oddVBand="0" w:evenVBand="0" w:oddHBand="0" w:evenHBand="0" w:firstRowFirstColumn="0" w:firstRowLastColumn="0" w:lastRowFirstColumn="0" w:lastRowLastColumn="0"/>
-            </w:pPr>
-          </w:p>
-        </w:tc>
-        <w:tc>
-          <w:tcPr>
-            <w:tcW w:w="1497" w:type="dxa"/>
-          </w:tcPr>
-          <w:p>
-            <w:pPr>
-              <w:cnfStyle w:val="000000000000" w:firstRow="0" w:lastRow="0" w:firstColumn="0" w:lastColumn="0" w:oddVBand="0" w:evenVBand="0" w:oddHBand="0" w:evenHBand="0" w:firstRowFirstColumn="0" w:firstRowLastColumn="0" w:lastRowFirstColumn="0" w:lastRowLastColumn="0"/>
-            </w:pPr>
-          </w:p>
-        </w:tc>
-        <w:tc>
-          <w:tcPr>
-            <w:tcW w:w="1497" w:type="dxa"/>
-          </w:tcPr>
-          <w:p>
-            <w:pPr>
-              <w:cnfStyle w:val="000000000000" w:firstRow="0" w:lastRow="0" w:firstColumn="0" w:lastColumn="0" w:oddVBand="0" w:evenVBand="0" w:oddHBand="0" w:evenHBand="0" w:firstRowFirstColumn="0" w:firstRowLastColumn="0" w:lastRowFirstColumn="0" w:lastRowLastColumn="0"/>
-            </w:pPr>
-          </w:p>
-        </w:tc>
-        <w:tc>
-          <w:tcPr>
-            <w:tcW w:w="1497" w:type="dxa"/>
-          </w:tcPr>
-          <w:p>
-            <w:pPr>
-              <w:cnfStyle w:val="000000000000" w:firstRow="0" w:lastRow="0" w:firstColumn="0" w:lastColumn="0" w:oddVBand="0" w:evenVBand="0" w:oddHBand="0" w:evenHBand="0" w:firstRowFirstColumn="0" w:firstRowLastColumn="0" w:lastRowFirstColumn="0" w:lastRowLastColumn="0"/>
-            </w:pPr>
-          </w:p>
-        </w:tc>
-      </w:tr>
-    </w:tbl>
-    <w:p/>
+    <w:p>
+      <w:pPr>
+        <w:ind w:left="220" w:hangingChars="100" w:hanging="220"/>
+        <w:rPr>
+          <w:rFonts w:hint="eastAsia"/>
+        </w:rPr>
+      </w:pPr>
+      <w:r>
+        <w:rPr>
+          <w:rFonts w:ascii="Arial Unicode MS" w:eastAsia="Arial Unicode MS" w:hAnsi="Arial Unicode MS" w:cs="Arial Unicode MS" w:hint="eastAsia"/>
+        </w:rPr>
+        <w:t>□</w:t>
+      </w:r>
+      <w:r>
+        <w:rPr>
+          <w:rFonts w:hint="eastAsia"/>
+        </w:rPr>
+        <w:t xml:space="preserve"> </w:t>
+      </w:r>
+      <w:r>
+        <w:t>Claude는 Anthropic이 개발한 대화형 AI로, 문서 작성·요약·분석·코드 작성 등 다양한 업무를 지원합니다.</w:t>
+      </w:r>
+    </w:p>
+    <w:p>
+      <w:pPr>
+        <w:ind w:left="220" w:hangingChars="100" w:hanging="220"/>
+        <w:rPr>
+          <w:rFonts w:hint="eastAsia"/>
+        </w:rPr>
+      </w:pPr>
+      <w:r>
+        <w:rPr>
+          <w:rFonts w:ascii="Arial Unicode MS" w:eastAsia="Arial Unicode MS" w:hAnsi="Arial Unicode MS" w:cs="Arial Unicode MS" w:hint="eastAsia"/>
+        </w:rPr>
+        <w:t>□</w:t>
+      </w:r>
+      <w:r>
+        <w:rPr>
+          <w:rFonts w:hint="eastAsia"/>
+        </w:rPr>
+        <w:t xml:space="preserve"> </w:t>
+      </w:r>
+      <w:r>
+        <w:t>자연스러운 대화와 긴 문맥 이해에 강점이 있어 업무 생산성과 협업 효율을 높이는 데 유용합니다.</w:t>
+      </w:r>
+    </w:p>
+    <w:p>
+      <w:pPr>
+        <w:ind w:leftChars="100" w:left="440" w:hangingChars="100" w:hanging="220"/>
+        <w:rPr>
+          <w:rFonts w:asciiTheme="minorEastAsia" w:hAnsiTheme="minorEastAsia" w:hint="eastAsia"/>
+        </w:rPr>
+      </w:pPr>
+      <w:r>
+        <w:rPr>
+          <w:rFonts w:asciiTheme="minorEastAsia" w:hAnsiTheme="minorEastAsia" w:hint="eastAsia"/>
+        </w:rPr>
+        <w:t xml:space="preserve">◌ </w:t>
+      </w:r>
+      <w:r>
+        <w:rPr>
+          <w:rFonts w:asciiTheme="minorEastAsia" w:hAnsiTheme="minorEastAsia"/>
+        </w:rPr>
+        <w:t>컨텍스트 엔지니어링은 AI가 더 정확하고 유용한 답을 하도록, 필요한 배경정보·지시사항·예시·데이터를 구조적으로 설계하고 제공하는 작업입니다.</w:t>
+      </w:r>
+    </w:p>
+    <w:p>
+      <w:pPr>
+        <w:ind w:leftChars="200" w:left="660" w:hangingChars="100" w:hanging="220"/>
+        <w:rPr>
+          <w:rFonts w:hint="eastAsia"/>
+        </w:rPr>
+      </w:pPr>
+      <w:r>
+        <w:rPr>
+          <w:rFonts w:hint="eastAsia"/>
+        </w:rPr>
+        <w:t xml:space="preserve">- </w:t>
+      </w:r>
+      <w:proofErr w:type="spellStart"/>
+      <w:r>
+        <w:t>하네스</w:t>
+      </w:r>
+      <w:proofErr w:type="spellEnd"/>
+      <w:r>
+        <w:t xml:space="preserve"> 엔지니어링은 전기·전자 장비에 전력과 신호를 안정적으로 전달하기 위해 전선, 커넥터, 단자, </w:t>
+      </w:r>
+      <w:proofErr w:type="spellStart"/>
+      <w:r>
+        <w:t>보호재</w:t>
+      </w:r>
+      <w:proofErr w:type="spellEnd"/>
+      <w:r>
+        <w:t xml:space="preserve"> 등을 체계적으로 설계하는 기술입니다.</w:t>
+      </w:r>
+    </w:p>
+    <w:p>
+      <w:pPr>
+        <w:ind w:leftChars="200" w:left="660" w:hangingChars="100" w:hanging="220"/>
+        <w:rPr>
+          <w:rFonts w:hint="eastAsia"/>
+        </w:rPr>
+      </w:pPr>
+      <w:r>
+        <w:rPr>
+          <w:rFonts w:hint="eastAsia"/>
+        </w:rPr>
+        <w:t xml:space="preserve">- </w:t>
+      </w:r>
+      <w:r>
+        <w:t>쉽게 말하면, 자동차·항공기·선박·산업장비 안에서 여러 부품을 정확하게 연결하는 배선 시스템 설계라고 보면 됩니다</w:t>
+      </w:r>
+    </w:p>
+    <w:p>
+      <w:pPr>
+        <w:ind w:left="220" w:hangingChars="100" w:hanging="220"/>
+        <w:rPr>
+          <w:rFonts w:hint="eastAsia"/>
+        </w:rPr>
+      </w:pPr>
+      <w:r>
+        <w:rPr>
+          <w:rFonts w:ascii="Arial Unicode MS" w:eastAsia="Arial Unicode MS" w:hAnsi="Arial Unicode MS" w:cs="Arial Unicode MS" w:hint="eastAsia"/>
+        </w:rPr>
+        <w:t>□</w:t>
+      </w:r>
+      <w:r>
+        <w:rPr>
+          <w:rFonts w:hint="eastAsia"/>
+        </w:rPr>
+        <w:t xml:space="preserve"> </w:t>
+      </w:r>
+      <w:r>
+        <w:t xml:space="preserve">단순히 질문만 던지는 것이 아니라 </w:t>
+      </w:r>
+      <w:r>
+        <w:t>AI가 상황을 제대로 이해하도록 문맥을 설계하는 방법</w:t>
+      </w:r>
+      <w:r>
+        <w:t>입니다.</w:t>
+      </w:r>
+    </w:p>
+    <w:p>
+      <w:pPr>
+        <w:ind w:firstLineChars="100" w:firstLine="220"/>
+      </w:pPr>
+      <w:r>
+        <w:rPr>
+          <w:rFonts w:asciiTheme="minorEastAsia" w:hAnsiTheme="minorEastAsia" w:hint="eastAsia"/>
+        </w:rPr>
+        <w:t xml:space="preserve">◌ </w:t>
+      </w:r>
+      <w:r>
+        <w:rPr>
+          <w:rFonts w:asciiTheme="minorEastAsia" w:hAnsiTheme="minorEastAsia"/>
+        </w:rPr>
+        <w:t>AI가 무엇을 해야 하는지 명확히 지정</w:t>
+      </w:r>
+    </w:p>
+    <w:p>
+      <w:pPr>
+        <w:ind w:leftChars="136" w:left="519" w:hangingChars="100" w:hanging="220"/>
+      </w:pPr>
+      <w:r>
+        <w:rPr>
+          <w:rFonts w:hint="eastAsia"/>
+        </w:rPr>
+        <w:t xml:space="preserve">- </w:t>
+      </w:r>
+      <w:r>
+        <w:t xml:space="preserve">Claude 활용 관점에서 보면, </w:t>
+      </w:r>
+      <w:r>
+        <w:rPr>
+          <w:b/>
+          <w:bCs/>
+        </w:rPr>
+        <w:t>컨텍스트 엔지니어링</w:t>
+      </w:r>
+      <w:r>
+        <w:t>은 Claude가 일을 잘하도록 필요한 정보를 미리 정리해서 넣어주는 방식입니다.</w:t>
+      </w:r>
+    </w:p>
+    <w:p>
+      <w:pPr>
+        <w:spacing w:line="480" w:lineRule="auto"/>
+        <w:ind w:leftChars="136" w:left="519" w:hangingChars="100" w:hanging="220"/>
+        <w:rPr>
+          <w:rFonts w:hint="eastAsia"/>
+        </w:rPr>
+      </w:pPr>
+      <w:r>
+        <w:rPr>
+          <w:rFonts w:hint="eastAsia"/>
+        </w:rPr>
+        <w:t xml:space="preserve">- </w:t>
+      </w:r>
+      <w:r>
+        <w:t xml:space="preserve">즉, 질문만 주는 것이 아니라 </w:t>
+      </w:r>
+      <w:r>
+        <w:rPr>
+          <w:b/>
+          <w:bCs/>
+        </w:rPr>
+        <w:t>목적, 배경, 참고자료, 원하는 출력 형식, 제약조건</w:t>
+      </w:r>
+      <w:r>
+        <w:t>까</w:t>
+      </w:r>
+      <w:r>
+        <w:lastRenderedPageBreak/>
+        <w:t>지 함께 제공해 Claude의 답변 품질을 높이는 실무 기법입니다.</w:t>
+      </w:r>
+    </w:p>
+    <w:p>
+      <w:pPr>
+        <w:pStyle w:val="a6"/>
+        <w:numPr>
+          <w:ilvl w:val="0"/>
+          <w:numId w:val="11"/>
+        </w:numPr>
+      </w:pPr>
+      <w:proofErr w:type="spellStart"/>
+      <w:r>
+        <w:rPr>
+          <w:rFonts w:hint="eastAsia"/>
+        </w:rPr>
+        <w:t>목록단락</w:t>
+      </w:r>
+      <w:proofErr w:type="spellEnd"/>
+    </w:p>
+    <w:p>
+      <w:pPr>
+        <w:pStyle w:val="5"/>
+        <w:numPr>
+          <w:ilvl w:val="0"/>
+          <w:numId w:val="11"/>
+        </w:numPr>
+      </w:pPr>
+      <w:proofErr w:type="spellStart"/>
+      <w:r>
+        <w:rPr>
+          <w:rFonts w:hint="eastAsia"/>
+        </w:rPr>
+        <w:t>목록단락</w:t>
+      </w:r>
+      <w:proofErr w:type="spellEnd"/>
+      <w:r>
+        <w:rPr>
+          <w:rFonts w:hint="eastAsia"/>
+        </w:rPr>
+        <w:t>2</w:t>
+      </w:r>
+    </w:p>
     <w:sectPr>
       <w:pgSz w:w="11906" w:h="16838"/>
       <w:pgMar w:top="1701" w:right="1440" w:bottom="1440" w:left="1440" w:header="851" w:footer="992" w:gutter="0"/>
@@ -796,6 +731,95 @@
 <file path=word/numbering.xml><?xml version="1.0" encoding="utf-8"?>
 <w:numbering xmlns:wpc="http://schemas.microsoft.com/office/word/2010/wordprocessingCanvas" xmlns:cx="http://schemas.microsoft.com/office/drawing/2014/chartex" xmlns:cx1="http://schemas.microsoft.com/office/drawing/2015/9/8/chartex" xmlns:cx2="http://schemas.microsoft.com/office/drawing/2015/10/21/chartex" xmlns:cx3="http://schemas.microsoft.com/office/drawing/2016/5/9/chartex" xmlns:cx4="http://schemas.microsoft.com/office/drawing/2016/5/10/chartex" xmlns:cx5="http://schemas.microsoft.com/office/drawing/2016/5/11/chartex" xmlns:cx6="http://schemas.microsoft.com/office/drawing/2016/5/12/chartex" xmlns:cx7="http://schemas.microsoft.com/office/drawing/2016/5/13/chartex" xmlns:cx8="http://schemas.microsoft.com/office/drawing/2016/5/14/chartex" xmlns:mc="http://schemas.openxmlformats.org/markup-compatibility/2006" xmlns:aink="http://schemas.microsoft.com/office/drawing/2016/ink" xmlns:am3d="http://schemas.microsoft.com/office/drawing/2017/model3d" xmlns:o="urn:schemas-microsoft-com:office:office" xmlns:oel="http://schemas.microsoft.com/office/2019/extlst" xmlns:r="http://schemas.openxmlformats.org/officeDocument/2006/relationships" xmlns:m="http://schemas.openxmlformats.org/officeDocument/2006/math" xmlns:v="urn:schemas-microsoft-com:vml" xmlns:wp14="http://schemas.microsoft.com/office/word/2010/wordprocessingDrawing" xmlns:wp="http://schemas.openxmlformats.org/drawingml/2006/wordprocessingDrawing" xmlns:w10="urn:schemas-microsoft-com:office:word" xmlns:w="http://schemas.openxmlformats.org/wordprocessingml/2006/main" xmlns:w14="http://schemas.microsoft.com/office/word/2010/wordml" xmlns:w15="http://schemas.microsoft.com/office/word/2012/wordml" xmlns:w16cex="http://schemas.microsoft.com/office/word/2018/wordml/cex" xmlns:w16cid="http://schemas.microsoft.com/office/word/2016/wordml/cid" xmlns:w16="http://schemas.microsoft.com/office/word/2018/wordml" xmlns:w16du="http://schemas.microsoft.com/office/word/2023/wordml/word16du" xmlns:w16sdtdh="http://schemas.microsoft.com/office/word/2020/wordml/sdtdatahash" xmlns:w16sdtfl="http://schemas.microsoft.com/office/word/2024/wordml/sdtformatlock" xmlns:w16se="http://schemas.microsoft.com/office/word/2015/wordml/symex" xmlns:wpg="http://schemas.microsoft.com/office/word/2010/wordprocessingGroup" xmlns:wpi="http://schemas.microsoft.com/office/word/2010/wordprocessingInk" xmlns:wne="http://schemas.microsoft.com/office/word/2006/wordml" xmlns:wps="http://schemas.microsoft.com/office/word/2010/wordprocessingShape" mc:Ignorable="w14 w15 w16se w16cid w16 w16cex w16sdtdh w16sdtfl w16du wp14">
   <w:abstractNum w:abstractNumId="0" w15:restartNumberingAfterBreak="0">
+    <w:nsid w:val="05775ABF"/>
+    <w:multiLevelType w:val="hybridMultilevel"/>
+    <w:tmpl w:val="7BA4C2AC"/>
+    <w:lvl w:ilvl="0" w:tplc="D1589DF0">
+      <w:start w:val="1"/>
+      <w:numFmt w:val="decimal"/>
+      <w:lvlText w:val="%1."/>
+      <w:lvlJc w:val="left"/>
+      <w:pPr>
+        <w:ind w:left="1080" w:hanging="360"/>
+      </w:pPr>
+      <w:rPr>
+        <w:rFonts w:hint="default"/>
+      </w:rPr>
+    </w:lvl>
+    <w:lvl w:ilvl="1" w:tplc="04090019" w:tentative="1">
+      <w:start w:val="1"/>
+      <w:numFmt w:val="upperLetter"/>
+      <w:lvlText w:val="%2."/>
+      <w:lvlJc w:val="left"/>
+      <w:pPr>
+        <w:ind w:left="1600" w:hanging="440"/>
+      </w:pPr>
+    </w:lvl>
+    <w:lvl w:ilvl="2" w:tplc="0409001B" w:tentative="1">
+      <w:start w:val="1"/>
+      <w:numFmt w:val="lowerRoman"/>
+      <w:lvlText w:val="%3."/>
+      <w:lvlJc w:val="right"/>
+      <w:pPr>
+        <w:ind w:left="2040" w:hanging="440"/>
+      </w:pPr>
+    </w:lvl>
+    <w:lvl w:ilvl="3" w:tplc="0409000F" w:tentative="1">
+      <w:start w:val="1"/>
+      <w:numFmt w:val="decimal"/>
+      <w:lvlText w:val="%4."/>
+      <w:lvlJc w:val="left"/>
+      <w:pPr>
+        <w:ind w:left="2480" w:hanging="440"/>
+      </w:pPr>
+    </w:lvl>
+    <w:lvl w:ilvl="4" w:tplc="04090019" w:tentative="1">
+      <w:start w:val="1"/>
+      <w:numFmt w:val="upperLetter"/>
+      <w:lvlText w:val="%5."/>
+      <w:lvlJc w:val="left"/>
+      <w:pPr>
+        <w:ind w:left="2920" w:hanging="440"/>
+      </w:pPr>
+    </w:lvl>
+    <w:lvl w:ilvl="5" w:tplc="0409001B" w:tentative="1">
+      <w:start w:val="1"/>
+      <w:numFmt w:val="lowerRoman"/>
+      <w:lvlText w:val="%6."/>
+      <w:lvlJc w:val="right"/>
+      <w:pPr>
+        <w:ind w:left="3360" w:hanging="440"/>
+      </w:pPr>
+    </w:lvl>
+    <w:lvl w:ilvl="6" w:tplc="0409000F" w:tentative="1">
+      <w:start w:val="1"/>
+      <w:numFmt w:val="decimal"/>
+      <w:lvlText w:val="%7."/>
+      <w:lvlJc w:val="left"/>
+      <w:pPr>
+        <w:ind w:left="3800" w:hanging="440"/>
+      </w:pPr>
+    </w:lvl>
+    <w:lvl w:ilvl="7" w:tplc="04090019" w:tentative="1">
+      <w:start w:val="1"/>
+      <w:numFmt w:val="upperLetter"/>
+      <w:lvlText w:val="%8."/>
+      <w:lvlJc w:val="left"/>
+      <w:pPr>
+        <w:ind w:left="4240" w:hanging="440"/>
+      </w:pPr>
+    </w:lvl>
+    <w:lvl w:ilvl="8" w:tplc="0409001B" w:tentative="1">
+      <w:start w:val="1"/>
+      <w:numFmt w:val="lowerRoman"/>
+      <w:lvlText w:val="%9."/>
+      <w:lvlJc w:val="right"/>
+      <w:pPr>
+        <w:ind w:left="4680" w:hanging="440"/>
+      </w:pPr>
+    </w:lvl>
+  </w:abstractNum>
+  <w:abstractNum w:abstractNumId="1" w15:restartNumberingAfterBreak="0">
     <w:nsid w:val="076A2DCB"/>
     <w:multiLevelType w:val="multilevel"/>
     <w:tmpl w:val="63B80750"/>
@@ -920,7 +944,232 @@
       </w:rPr>
     </w:lvl>
   </w:abstractNum>
-  <w:abstractNum w:abstractNumId="1" w15:restartNumberingAfterBreak="0">
+  <w:abstractNum w:abstractNumId="2" w15:restartNumberingAfterBreak="0">
+    <w:nsid w:val="0F817625"/>
+    <w:multiLevelType w:val="hybridMultilevel"/>
+    <w:tmpl w:val="1C925A00"/>
+    <w:lvl w:ilvl="0" w:tplc="0C34A2EE">
+      <w:numFmt w:val="bullet"/>
+      <w:lvlText w:val="□"/>
+      <w:lvlJc w:val="left"/>
+      <w:pPr>
+        <w:ind w:left="659" w:hanging="360"/>
+      </w:pPr>
+      <w:rPr>
+        <w:rFonts w:ascii="Arial Unicode MS" w:eastAsia="Arial Unicode MS" w:hAnsi="Arial Unicode MS" w:cs="Arial Unicode MS" w:hint="eastAsia"/>
+      </w:rPr>
+    </w:lvl>
+    <w:lvl w:ilvl="1" w:tplc="04090003" w:tentative="1">
+      <w:start w:val="1"/>
+      <w:numFmt w:val="bullet"/>
+      <w:lvlText w:val=""/>
+      <w:lvlJc w:val="left"/>
+      <w:pPr>
+        <w:ind w:left="1179" w:hanging="440"/>
+      </w:pPr>
+      <w:rPr>
+        <w:rFonts w:ascii="Wingdings" w:hAnsi="Wingdings" w:hint="default"/>
+      </w:rPr>
+    </w:lvl>
+    <w:lvl w:ilvl="2" w:tplc="04090005" w:tentative="1">
+      <w:start w:val="1"/>
+      <w:numFmt w:val="bullet"/>
+      <w:lvlText w:val=""/>
+      <w:lvlJc w:val="left"/>
+      <w:pPr>
+        <w:ind w:left="1619" w:hanging="440"/>
+      </w:pPr>
+      <w:rPr>
+        <w:rFonts w:ascii="Wingdings" w:hAnsi="Wingdings" w:hint="default"/>
+      </w:rPr>
+    </w:lvl>
+    <w:lvl w:ilvl="3" w:tplc="04090001" w:tentative="1">
+      <w:start w:val="1"/>
+      <w:numFmt w:val="bullet"/>
+      <w:lvlText w:val=""/>
+      <w:lvlJc w:val="left"/>
+      <w:pPr>
+        <w:ind w:left="2059" w:hanging="440"/>
+      </w:pPr>
+      <w:rPr>
+        <w:rFonts w:ascii="Wingdings" w:hAnsi="Wingdings" w:hint="default"/>
+      </w:rPr>
+    </w:lvl>
+    <w:lvl w:ilvl="4" w:tplc="04090003" w:tentative="1">
+      <w:start w:val="1"/>
+      <w:numFmt w:val="bullet"/>
+      <w:lvlText w:val=""/>
+      <w:lvlJc w:val="left"/>
+      <w:pPr>
+        <w:ind w:left="2499" w:hanging="440"/>
+      </w:pPr>
+      <w:rPr>
+        <w:rFonts w:ascii="Wingdings" w:hAnsi="Wingdings" w:hint="default"/>
+      </w:rPr>
+    </w:lvl>
+    <w:lvl w:ilvl="5" w:tplc="04090005" w:tentative="1">
+      <w:start w:val="1"/>
+      <w:numFmt w:val="bullet"/>
+      <w:lvlText w:val=""/>
+      <w:lvlJc w:val="left"/>
+      <w:pPr>
+        <w:ind w:left="2939" w:hanging="440"/>
+      </w:pPr>
+      <w:rPr>
+        <w:rFonts w:ascii="Wingdings" w:hAnsi="Wingdings" w:hint="default"/>
+      </w:rPr>
+    </w:lvl>
+    <w:lvl w:ilvl="6" w:tplc="04090001" w:tentative="1">
+      <w:start w:val="1"/>
+      <w:numFmt w:val="bullet"/>
+      <w:lvlText w:val=""/>
+      <w:lvlJc w:val="left"/>
+      <w:pPr>
+        <w:ind w:left="3379" w:hanging="440"/>
+      </w:pPr>
+      <w:rPr>
+        <w:rFonts w:ascii="Wingdings" w:hAnsi="Wingdings" w:hint="default"/>
+      </w:rPr>
+    </w:lvl>
+    <w:lvl w:ilvl="7" w:tplc="04090003" w:tentative="1">
+      <w:start w:val="1"/>
+      <w:numFmt w:val="bullet"/>
+      <w:lvlText w:val=""/>
+      <w:lvlJc w:val="left"/>
+      <w:pPr>
+        <w:ind w:left="3819" w:hanging="440"/>
+      </w:pPr>
+      <w:rPr>
+        <w:rFonts w:ascii="Wingdings" w:hAnsi="Wingdings" w:hint="default"/>
+      </w:rPr>
+    </w:lvl>
+    <w:lvl w:ilvl="8" w:tplc="04090005" w:tentative="1">
+      <w:start w:val="1"/>
+      <w:numFmt w:val="bullet"/>
+      <w:lvlText w:val=""/>
+      <w:lvlJc w:val="left"/>
+      <w:pPr>
+        <w:ind w:left="4259" w:hanging="440"/>
+      </w:pPr>
+      <w:rPr>
+        <w:rFonts w:ascii="Wingdings" w:hAnsi="Wingdings" w:hint="default"/>
+      </w:rPr>
+    </w:lvl>
+  </w:abstractNum>
+  <w:abstractNum w:abstractNumId="3" w15:restartNumberingAfterBreak="0">
+    <w:nsid w:val="20807EDD"/>
+    <w:multiLevelType w:val="hybridMultilevel"/>
+    <w:tmpl w:val="91CE19F8"/>
+    <w:lvl w:ilvl="0" w:tplc="04090003">
+      <w:start w:val="1"/>
+      <w:numFmt w:val="bullet"/>
+      <w:lvlText w:val=""/>
+      <w:lvlJc w:val="left"/>
+      <w:pPr>
+        <w:ind w:left="880" w:hanging="440"/>
+      </w:pPr>
+      <w:rPr>
+        <w:rFonts w:ascii="Wingdings" w:hAnsi="Wingdings" w:hint="default"/>
+      </w:rPr>
+    </w:lvl>
+    <w:lvl w:ilvl="1" w:tplc="04090003" w:tentative="1">
+      <w:start w:val="1"/>
+      <w:numFmt w:val="bullet"/>
+      <w:lvlText w:val=""/>
+      <w:lvlJc w:val="left"/>
+      <w:pPr>
+        <w:ind w:left="1320" w:hanging="440"/>
+      </w:pPr>
+      <w:rPr>
+        <w:rFonts w:ascii="Wingdings" w:hAnsi="Wingdings" w:hint="default"/>
+      </w:rPr>
+    </w:lvl>
+    <w:lvl w:ilvl="2" w:tplc="04090005" w:tentative="1">
+      <w:start w:val="1"/>
+      <w:numFmt w:val="bullet"/>
+      <w:lvlText w:val=""/>
+      <w:lvlJc w:val="left"/>
+      <w:pPr>
+        <w:ind w:left="1760" w:hanging="440"/>
+      </w:pPr>
+      <w:rPr>
+        <w:rFonts w:ascii="Wingdings" w:hAnsi="Wingdings" w:hint="default"/>
+      </w:rPr>
+    </w:lvl>
+    <w:lvl w:ilvl="3" w:tplc="04090001" w:tentative="1">
+      <w:start w:val="1"/>
+      <w:numFmt w:val="bullet"/>
+      <w:lvlText w:val=""/>
+      <w:lvlJc w:val="left"/>
+      <w:pPr>
+        <w:ind w:left="2200" w:hanging="440"/>
+      </w:pPr>
+      <w:rPr>
+        <w:rFonts w:ascii="Wingdings" w:hAnsi="Wingdings" w:hint="default"/>
+      </w:rPr>
+    </w:lvl>
+    <w:lvl w:ilvl="4" w:tplc="04090003" w:tentative="1">
+      <w:start w:val="1"/>
+      <w:numFmt w:val="bullet"/>
+      <w:lvlText w:val=""/>
+      <w:lvlJc w:val="left"/>
+      <w:pPr>
+        <w:ind w:left="2640" w:hanging="440"/>
+      </w:pPr>
+      <w:rPr>
+        <w:rFonts w:ascii="Wingdings" w:hAnsi="Wingdings" w:hint="default"/>
+      </w:rPr>
+    </w:lvl>
+    <w:lvl w:ilvl="5" w:tplc="04090005" w:tentative="1">
+      <w:start w:val="1"/>
+      <w:numFmt w:val="bullet"/>
+      <w:lvlText w:val=""/>
+      <w:lvlJc w:val="left"/>
+      <w:pPr>
+        <w:ind w:left="3080" w:hanging="440"/>
+      </w:pPr>
+      <w:rPr>
+        <w:rFonts w:ascii="Wingdings" w:hAnsi="Wingdings" w:hint="default"/>
+      </w:rPr>
+    </w:lvl>
+    <w:lvl w:ilvl="6" w:tplc="04090001" w:tentative="1">
+      <w:start w:val="1"/>
+      <w:numFmt w:val="bullet"/>
+      <w:lvlText w:val=""/>
+      <w:lvlJc w:val="left"/>
+      <w:pPr>
+        <w:ind w:left="3520" w:hanging="440"/>
+      </w:pPr>
+      <w:rPr>
+        <w:rFonts w:ascii="Wingdings" w:hAnsi="Wingdings" w:hint="default"/>
+      </w:rPr>
+    </w:lvl>
+    <w:lvl w:ilvl="7" w:tplc="04090003" w:tentative="1">
+      <w:start w:val="1"/>
+      <w:numFmt w:val="bullet"/>
+      <w:lvlText w:val=""/>
+      <w:lvlJc w:val="left"/>
+      <w:pPr>
+        <w:ind w:left="3960" w:hanging="440"/>
+      </w:pPr>
+      <w:rPr>
+        <w:rFonts w:ascii="Wingdings" w:hAnsi="Wingdings" w:hint="default"/>
+      </w:rPr>
+    </w:lvl>
+    <w:lvl w:ilvl="8" w:tplc="04090005" w:tentative="1">
+      <w:start w:val="1"/>
+      <w:numFmt w:val="bullet"/>
+      <w:lvlText w:val=""/>
+      <w:lvlJc w:val="left"/>
+      <w:pPr>
+        <w:ind w:left="4400" w:hanging="440"/>
+      </w:pPr>
+      <w:rPr>
+        <w:rFonts w:ascii="Wingdings" w:hAnsi="Wingdings" w:hint="default"/>
+      </w:rPr>
+    </w:lvl>
+  </w:abstractNum>
+  <w:abstractNum w:abstractNumId="4" w15:restartNumberingAfterBreak="0">
     <w:nsid w:val="44D42E2D"/>
     <w:multiLevelType w:val="multilevel"/>
     <w:tmpl w:val="0409001D"/>
@@ -1006,7 +1255,185 @@
       </w:pPr>
     </w:lvl>
   </w:abstractNum>
-  <w:abstractNum w:abstractNumId="2" w15:restartNumberingAfterBreak="0">
+  <w:abstractNum w:abstractNumId="5" w15:restartNumberingAfterBreak="0">
+    <w:nsid w:val="4AB83E83"/>
+    <w:multiLevelType w:val="hybridMultilevel"/>
+    <w:tmpl w:val="9A32F532"/>
+    <w:lvl w:ilvl="0" w:tplc="35CC2506">
+      <w:start w:val="1"/>
+      <w:numFmt w:val="decimal"/>
+      <w:lvlText w:val="%1."/>
+      <w:lvlJc w:val="left"/>
+      <w:pPr>
+        <w:ind w:left="800" w:hanging="360"/>
+      </w:pPr>
+      <w:rPr>
+        <w:rFonts w:hint="eastAsia"/>
+      </w:rPr>
+    </w:lvl>
+    <w:lvl w:ilvl="1" w:tplc="04090019" w:tentative="1">
+      <w:start w:val="1"/>
+      <w:numFmt w:val="upperLetter"/>
+      <w:lvlText w:val="%2."/>
+      <w:lvlJc w:val="left"/>
+      <w:pPr>
+        <w:ind w:left="1320" w:hanging="440"/>
+      </w:pPr>
+    </w:lvl>
+    <w:lvl w:ilvl="2" w:tplc="0409001B" w:tentative="1">
+      <w:start w:val="1"/>
+      <w:numFmt w:val="lowerRoman"/>
+      <w:lvlText w:val="%3."/>
+      <w:lvlJc w:val="right"/>
+      <w:pPr>
+        <w:ind w:left="1760" w:hanging="440"/>
+      </w:pPr>
+    </w:lvl>
+    <w:lvl w:ilvl="3" w:tplc="0409000F" w:tentative="1">
+      <w:start w:val="1"/>
+      <w:numFmt w:val="decimal"/>
+      <w:lvlText w:val="%4."/>
+      <w:lvlJc w:val="left"/>
+      <w:pPr>
+        <w:ind w:left="2200" w:hanging="440"/>
+      </w:pPr>
+    </w:lvl>
+    <w:lvl w:ilvl="4" w:tplc="04090019" w:tentative="1">
+      <w:start w:val="1"/>
+      <w:numFmt w:val="upperLetter"/>
+      <w:lvlText w:val="%5."/>
+      <w:lvlJc w:val="left"/>
+      <w:pPr>
+        <w:ind w:left="2640" w:hanging="440"/>
+      </w:pPr>
+    </w:lvl>
+    <w:lvl w:ilvl="5" w:tplc="0409001B" w:tentative="1">
+      <w:start w:val="1"/>
+      <w:numFmt w:val="lowerRoman"/>
+      <w:lvlText w:val="%6."/>
+      <w:lvlJc w:val="right"/>
+      <w:pPr>
+        <w:ind w:left="3080" w:hanging="440"/>
+      </w:pPr>
+    </w:lvl>
+    <w:lvl w:ilvl="6" w:tplc="0409000F" w:tentative="1">
+      <w:start w:val="1"/>
+      <w:numFmt w:val="decimal"/>
+      <w:lvlText w:val="%7."/>
+      <w:lvlJc w:val="left"/>
+      <w:pPr>
+        <w:ind w:left="3520" w:hanging="440"/>
+      </w:pPr>
+    </w:lvl>
+    <w:lvl w:ilvl="7" w:tplc="04090019" w:tentative="1">
+      <w:start w:val="1"/>
+      <w:numFmt w:val="upperLetter"/>
+      <w:lvlText w:val="%8."/>
+      <w:lvlJc w:val="left"/>
+      <w:pPr>
+        <w:ind w:left="3960" w:hanging="440"/>
+      </w:pPr>
+    </w:lvl>
+    <w:lvl w:ilvl="8" w:tplc="0409001B" w:tentative="1">
+      <w:start w:val="1"/>
+      <w:numFmt w:val="lowerRoman"/>
+      <w:lvlText w:val="%9."/>
+      <w:lvlJc w:val="right"/>
+      <w:pPr>
+        <w:ind w:left="4400" w:hanging="440"/>
+      </w:pPr>
+    </w:lvl>
+  </w:abstractNum>
+  <w:abstractNum w:abstractNumId="6" w15:restartNumberingAfterBreak="0">
+    <w:nsid w:val="4D2950E5"/>
+    <w:multiLevelType w:val="hybridMultilevel"/>
+    <w:tmpl w:val="7982E2C0"/>
+    <w:lvl w:ilvl="0" w:tplc="1E784D8C">
+      <w:start w:val="1"/>
+      <w:numFmt w:val="decimal"/>
+      <w:lvlText w:val="%1."/>
+      <w:lvlJc w:val="left"/>
+      <w:pPr>
+        <w:ind w:left="800" w:hanging="360"/>
+      </w:pPr>
+      <w:rPr>
+        <w:rFonts w:hint="eastAsia"/>
+      </w:rPr>
+    </w:lvl>
+    <w:lvl w:ilvl="1" w:tplc="04090019" w:tentative="1">
+      <w:start w:val="1"/>
+      <w:numFmt w:val="upperLetter"/>
+      <w:lvlText w:val="%2."/>
+      <w:lvlJc w:val="left"/>
+      <w:pPr>
+        <w:ind w:left="1320" w:hanging="440"/>
+      </w:pPr>
+    </w:lvl>
+    <w:lvl w:ilvl="2" w:tplc="0409001B" w:tentative="1">
+      <w:start w:val="1"/>
+      <w:numFmt w:val="lowerRoman"/>
+      <w:lvlText w:val="%3."/>
+      <w:lvlJc w:val="right"/>
+      <w:pPr>
+        <w:ind w:left="1760" w:hanging="440"/>
+      </w:pPr>
+    </w:lvl>
+    <w:lvl w:ilvl="3" w:tplc="0409000F" w:tentative="1">
+      <w:start w:val="1"/>
+      <w:numFmt w:val="decimal"/>
+      <w:lvlText w:val="%4."/>
+      <w:lvlJc w:val="left"/>
+      <w:pPr>
+        <w:ind w:left="2200" w:hanging="440"/>
+      </w:pPr>
+    </w:lvl>
+    <w:lvl w:ilvl="4" w:tplc="04090019" w:tentative="1">
+      <w:start w:val="1"/>
+      <w:numFmt w:val="upperLetter"/>
+      <w:lvlText w:val="%5."/>
+      <w:lvlJc w:val="left"/>
+      <w:pPr>
+        <w:ind w:left="2640" w:hanging="440"/>
+      </w:pPr>
+    </w:lvl>
+    <w:lvl w:ilvl="5" w:tplc="0409001B" w:tentative="1">
+      <w:start w:val="1"/>
+      <w:numFmt w:val="lowerRoman"/>
+      <w:lvlText w:val="%6."/>
+      <w:lvlJc w:val="right"/>
+      <w:pPr>
+        <w:ind w:left="3080" w:hanging="440"/>
+      </w:pPr>
+    </w:lvl>
+    <w:lvl w:ilvl="6" w:tplc="0409000F" w:tentative="1">
+      <w:start w:val="1"/>
+      <w:numFmt w:val="decimal"/>
+      <w:lvlText w:val="%7."/>
+      <w:lvlJc w:val="left"/>
+      <w:pPr>
+        <w:ind w:left="3520" w:hanging="440"/>
+      </w:pPr>
+    </w:lvl>
+    <w:lvl w:ilvl="7" w:tplc="04090019" w:tentative="1">
+      <w:start w:val="1"/>
+      <w:numFmt w:val="upperLetter"/>
+      <w:lvlText w:val="%8."/>
+      <w:lvlJc w:val="left"/>
+      <w:pPr>
+        <w:ind w:left="3960" w:hanging="440"/>
+      </w:pPr>
+    </w:lvl>
+    <w:lvl w:ilvl="8" w:tplc="0409001B" w:tentative="1">
+      <w:start w:val="1"/>
+      <w:numFmt w:val="lowerRoman"/>
+      <w:lvlText w:val="%9."/>
+      <w:lvlJc w:val="right"/>
+      <w:pPr>
+        <w:ind w:left="4400" w:hanging="440"/>
+      </w:pPr>
+    </w:lvl>
+  </w:abstractNum>
+  <w:abstractNum w:abstractNumId="7" w15:restartNumberingAfterBreak="0">
     <w:nsid w:val="4E2C4468"/>
     <w:multiLevelType w:val="multilevel"/>
     <w:tmpl w:val="CA12A530"/>
@@ -1124,7 +1551,7 @@
       </w:rPr>
     </w:lvl>
   </w:abstractNum>
-  <w:abstractNum w:abstractNumId="3" w15:restartNumberingAfterBreak="0">
+  <w:abstractNum w:abstractNumId="8" w15:restartNumberingAfterBreak="0">
     <w:nsid w:val="608A46D9"/>
     <w:multiLevelType w:val="multilevel"/>
     <w:tmpl w:val="63B80750"/>
@@ -1242,7 +1669,120 @@
       </w:rPr>
     </w:lvl>
   </w:abstractNum>
-  <w:abstractNum w:abstractNumId="4" w15:restartNumberingAfterBreak="0">
+  <w:abstractNum w:abstractNumId="9" w15:restartNumberingAfterBreak="0">
+    <w:nsid w:val="61DF661F"/>
+    <w:multiLevelType w:val="hybridMultilevel"/>
+    <w:tmpl w:val="3E0EF4B8"/>
+    <w:lvl w:ilvl="0" w:tplc="54FE16A8">
+      <w:start w:val="1"/>
+      <w:numFmt w:val="bullet"/>
+      <w:lvlText w:val="□"/>
+      <w:lvlJc w:val="left"/>
+      <w:pPr>
+        <w:ind w:left="1240" w:hanging="440"/>
+      </w:pPr>
+      <w:rPr>
+        <w:rFonts w:ascii="맑은 고딕" w:eastAsia="맑은 고딕" w:hAnsi="맑은 고딕" w:hint="eastAsia"/>
+      </w:rPr>
+    </w:lvl>
+    <w:lvl w:ilvl="1" w:tplc="04090003" w:tentative="1">
+      <w:start w:val="1"/>
+      <w:numFmt w:val="bullet"/>
+      <w:lvlText w:val=""/>
+      <w:lvlJc w:val="left"/>
+      <w:pPr>
+        <w:ind w:left="960" w:hanging="440"/>
+      </w:pPr>
+      <w:rPr>
+        <w:rFonts w:ascii="Wingdings" w:hAnsi="Wingdings" w:hint="default"/>
+      </w:rPr>
+    </w:lvl>
+    <w:lvl w:ilvl="2" w:tplc="04090005" w:tentative="1">
+      <w:start w:val="1"/>
+      <w:numFmt w:val="bullet"/>
+      <w:lvlText w:val=""/>
+      <w:lvlJc w:val="left"/>
+      <w:pPr>
+        <w:ind w:left="1400" w:hanging="440"/>
+      </w:pPr>
+      <w:rPr>
+        <w:rFonts w:ascii="Wingdings" w:hAnsi="Wingdings" w:hint="default"/>
+      </w:rPr>
+    </w:lvl>
+    <w:lvl w:ilvl="3" w:tplc="04090001" w:tentative="1">
+      <w:start w:val="1"/>
+      <w:numFmt w:val="bullet"/>
+      <w:lvlText w:val=""/>
+      <w:lvlJc w:val="left"/>
+      <w:pPr>
+        <w:ind w:left="1840" w:hanging="440"/>
+      </w:pPr>
+      <w:rPr>
+        <w:rFonts w:ascii="Wingdings" w:hAnsi="Wingdings" w:hint="default"/>
+      </w:rPr>
+    </w:lvl>
+    <w:lvl w:ilvl="4" w:tplc="04090003" w:tentative="1">
+      <w:start w:val="1"/>
+      <w:numFmt w:val="bullet"/>
+      <w:lvlText w:val=""/>
+      <w:lvlJc w:val="left"/>
+      <w:pPr>
+        <w:ind w:left="2280" w:hanging="440"/>
+      </w:pPr>
+      <w:rPr>
+        <w:rFonts w:ascii="Wingdings" w:hAnsi="Wingdings" w:hint="default"/>
+      </w:rPr>
+    </w:lvl>
+    <w:lvl w:ilvl="5" w:tplc="04090005" w:tentative="1">
+      <w:start w:val="1"/>
+      <w:numFmt w:val="bullet"/>
+      <w:lvlText w:val=""/>
+      <w:lvlJc w:val="left"/>
+      <w:pPr>
+        <w:ind w:left="2720" w:hanging="440"/>
+      </w:pPr>
+      <w:rPr>
+        <w:rFonts w:ascii="Wingdings" w:hAnsi="Wingdings" w:hint="default"/>
+      </w:rPr>
+    </w:lvl>
+    <w:lvl w:ilvl="6" w:tplc="04090001" w:tentative="1">
+      <w:start w:val="1"/>
+      <w:numFmt w:val="bullet"/>
+      <w:lvlText w:val=""/>
+      <w:lvlJc w:val="left"/>
+      <w:pPr>
+        <w:ind w:left="3160" w:hanging="440"/>
+      </w:pPr>
+      <w:rPr>
+        <w:rFonts w:ascii="Wingdings" w:hAnsi="Wingdings" w:hint="default"/>
+      </w:rPr>
+    </w:lvl>
+    <w:lvl w:ilvl="7" w:tplc="04090003" w:tentative="1">
+      <w:start w:val="1"/>
+      <w:numFmt w:val="bullet"/>
+      <w:lvlText w:val=""/>
+      <w:lvlJc w:val="left"/>
+      <w:pPr>
+        <w:ind w:left="3600" w:hanging="440"/>
+      </w:pPr>
+      <w:rPr>
+        <w:rFonts w:ascii="Wingdings" w:hAnsi="Wingdings" w:hint="default"/>
+      </w:rPr>
+    </w:lvl>
+    <w:lvl w:ilvl="8" w:tplc="04090005" w:tentative="1">
+      <w:start w:val="1"/>
+      <w:numFmt w:val="bullet"/>
+      <w:lvlText w:val=""/>
+      <w:lvlJc w:val="left"/>
+      <w:pPr>
+        <w:ind w:left="4040" w:hanging="440"/>
+      </w:pPr>
+      <w:rPr>
+        <w:rFonts w:ascii="Wingdings" w:hAnsi="Wingdings" w:hint="default"/>
+      </w:rPr>
+    </w:lvl>
+  </w:abstractNum>
+  <w:abstractNum w:abstractNumId="10" w15:restartNumberingAfterBreak="0">
     <w:nsid w:val="6CA3008C"/>
     <w:multiLevelType w:val="multilevel"/>
     <w:tmpl w:val="3DFE8C84"/>
@@ -1355,7 +1895,7 @@
       </w:rPr>
     </w:lvl>
   </w:abstractNum>
-  <w:abstractNum w:abstractNumId="5" w15:restartNumberingAfterBreak="0">
+  <w:abstractNum w:abstractNumId="11" w15:restartNumberingAfterBreak="0">
     <w:nsid w:val="7119171A"/>
     <w:multiLevelType w:val="multilevel"/>
     <w:tmpl w:val="0409001D"/>
@@ -1442,22 +1982,40 @@
     </w:lvl>
   </w:abstractNum>
   <w:num w:numId="1" w16cid:durableId="1075275835">
+    <w:abstractNumId w:val="10"/>
+  </w:num>
+  <w:num w:numId="2" w16cid:durableId="1500190160">
+    <w:abstractNumId w:val="1"/>
+  </w:num>
+  <w:num w:numId="3" w16cid:durableId="2012296040">
+    <w:abstractNumId w:val="11"/>
+  </w:num>
+  <w:num w:numId="4" w16cid:durableId="1822850565">
     <w:abstractNumId w:val="4"/>
   </w:num>
-  <w:num w:numId="2" w16cid:durableId="1500190160">
-    <w:abstractNumId w:val="0"/>
+  <w:num w:numId="5" w16cid:durableId="821313292">
+    <w:abstractNumId w:val="7"/>
   </w:num>
-  <w:num w:numId="3" w16cid:durableId="2012296040">
+  <w:num w:numId="6" w16cid:durableId="705761220">
+    <w:abstractNumId w:val="8"/>
+  </w:num>
+  <w:num w:numId="7" w16cid:durableId="630282402">
+    <w:abstractNumId w:val="2"/>
+  </w:num>
+  <w:num w:numId="8" w16cid:durableId="1802532632">
     <w:abstractNumId w:val="5"/>
   </w:num>
-  <w:num w:numId="4" w16cid:durableId="1822850565">
-    <w:abstractNumId w:val="1"/>
+  <w:num w:numId="9" w16cid:durableId="751969582">
+    <w:abstractNumId w:val="6"/>
   </w:num>
-  <w:num w:numId="5" w16cid:durableId="821313292">
-    <w:abstractNumId w:val="2"/>
+  <w:num w:numId="10" w16cid:durableId="455828437">
+    <w:abstractNumId w:val="3"/>
   </w:num>
-  <w:num w:numId="6" w16cid:durableId="705761220">
-    <w:abstractNumId w:val="3"/>
+  <w:num w:numId="11" w16cid:durableId="1422289966">
+    <w:abstractNumId w:val="9"/>
+  </w:num>
+  <w:num w:numId="12" w16cid:durableId="1865363181">
+    <w:abstractNumId w:val="0"/>
   </w:num>
 </w:numbering>
 </file>
@@ -1639,7 +2197,7 @@
     <w:lsdException w:name="Table Grid" w:uiPriority="39"/>
     <w:lsdException w:name="Table Theme" w:semiHidden="1" w:unhideWhenUsed="1"/>
     <w:lsdException w:name="Placeholder Text" w:semiHidden="1"/>
-    <w:lsdException w:name="No Spacing" w:uiPriority="1" w:qFormat="1"/>
+    <w:lsdException w:name="No Spacing" w:uiPriority="1"/>
     <w:lsdException w:name="Light Shading" w:uiPriority="60"/>
     <w:lsdException w:name="Light List" w:uiPriority="61"/>
     <w:lsdException w:name="Light Grid" w:uiPriority="62"/>
@@ -2055,7 +2613,6 @@
   <w:style w:type="character" w:default="1" w:styleId="a0">
     <w:name w:val="Default Paragraph Font"/>
     <w:uiPriority w:val="1"/>
-    <w:semiHidden/>
     <w:unhideWhenUsed/>
   </w:style>
   <w:style w:type="table" w:default="1" w:styleId="a1">

</xml_diff>